<commit_message>
Añadir pruebas para hacer los escenarios mas robustos, y reemplazar la URL de postman por la de la api de Render
</commit_message>
<xml_diff>
--- a/docs/Informe-TutorLink.docx
+++ b/docs/Informe-TutorLink.docx
@@ -6162,7 +6162,7 @@
           <w:color w:val="222222"/>
           <w:sz w:val="22"/>
         </w:rPr>
-        <w:t>Controlador: src/review/review.controller.ts. Tag: Reviews. Una reserva COMPLETED admite una sola reseña, y solo la puede escribir el estudiante dueño.</w:t>
+        <w:t>Controlador: src/review/review.controller.ts. Tag: Reviews. Una reserva COMPLETED admite una sola reseña, y solo la puede escribir el estudiante dueño. ReviewModule importa UserModule para que el guard de JWT y el de roles queden registrados en estas rutas.</w:t>
       </w:r>
     </w:p>
     <w:p>
@@ -7111,7 +7111,7 @@
           <w:color w:val="222222"/>
           <w:sz w:val="22"/>
         </w:rPr>
-        <w:t>Hay 15 archivos *.spec.ts y 80 pruebas. Cubren los servicios y controladores de usuarios, materias, tutores, reservas, reseñas y seed, más la estrategia JWT, el guard de roles y el decorador @Auth. Los repositorios de TypeORM se sustituyen con mocks. vitest.config.ts exige al menos 80 % de líneas, funciones, branches y statements sobre src, excluyendo módulos, archivos de prueba y main.ts.</w:t>
+        <w:t>Hay 15 archivos *.spec.ts y 92 pruebas. Cubren los servicios y controladores de usuarios, materias, tutores, reservas, reseñas y seed, más la estrategia JWT, el guard de roles y el decorador @Auth. Además de los caminos felices, prueban rechazos de horario, cruce de reservas, roles, reseña duplicada, reseña ajena y errores inesperados de base de datos. Los repositorios de TypeORM se sustituyen con mocks. vitest.config.ts exige al menos 80 % de líneas, funciones, branches y statements sobre src, excluyendo módulos, archivos de prueba y main.ts.</w:t>
       </w:r>
     </w:p>
     <w:p>
@@ -7225,7 +7225,9 @@
             <w:tcW w:type="dxa" w:w="3173"/>
           </w:tcPr>
           <w:p>
-            <w:r/>
+            <w:r>
+              <w:t>94,13 % (369/392)</w:t>
+            </w:r>
             <w:r>
               <w:rPr>
                 <w:rFonts w:ascii="Calibri" w:hAnsi="Calibri" w:eastAsia="Calibri"/>
@@ -7234,7 +7236,6 @@
                 <w:color w:val="222222"/>
                 <w:sz w:val="20"/>
               </w:rPr>
-              <w:t>90,05 % (353/392)</w:t>
             </w:r>
           </w:p>
         </w:tc>
@@ -7283,7 +7284,9 @@
             <w:shd w:fill="F3F6F9" w:val="clear"/>
           </w:tcPr>
           <w:p>
-            <w:r/>
+            <w:r>
+              <w:t>90,32 % (140/155)</w:t>
+            </w:r>
             <w:r>
               <w:rPr>
                 <w:rFonts w:ascii="Calibri" w:hAnsi="Calibri" w:eastAsia="Calibri"/>
@@ -7292,7 +7295,6 @@
                 <w:color w:val="222222"/>
                 <w:sz w:val="20"/>
               </w:rPr>
-              <w:t>82,58 % (128/155)</w:t>
             </w:r>
           </w:p>
         </w:tc>
@@ -7340,7 +7342,9 @@
             <w:tcW w:type="dxa" w:w="3173"/>
           </w:tcPr>
           <w:p>
-            <w:r/>
+            <w:r>
+              <w:t>84,61 % (88/104)</w:t>
+            </w:r>
             <w:r>
               <w:rPr>
                 <w:rFonts w:ascii="Calibri" w:hAnsi="Calibri" w:eastAsia="Calibri"/>
@@ -7349,7 +7353,6 @@
                 <w:color w:val="222222"/>
                 <w:sz w:val="20"/>
               </w:rPr>
-              <w:t>82,69 % (86/104)</w:t>
             </w:r>
           </w:p>
         </w:tc>
@@ -7398,7 +7401,9 @@
             <w:shd w:fill="F3F6F9" w:val="clear"/>
           </w:tcPr>
           <w:p>
-            <w:r/>
+            <w:r>
+              <w:t>94,8 % (347/366)</w:t>
+            </w:r>
             <w:r>
               <w:rPr>
                 <w:rFonts w:ascii="Calibri" w:hAnsi="Calibri" w:eastAsia="Calibri"/>
@@ -7407,7 +7412,6 @@
                 <w:color w:val="222222"/>
                 <w:sz w:val="20"/>
               </w:rPr>
-              <w:t>90,98 % (333/366)</w:t>
             </w:r>
           </w:p>
         </w:tc>
@@ -7459,7 +7463,7 @@
           <w:color w:val="222222"/>
           <w:sz w:val="22"/>
         </w:rPr>
-        <w:t>Las 80 pruebas pasan.</w:t>
+        <w:t>Las 92 pruebas pasan.</w:t>
       </w:r>
     </w:p>
     <w:p>
@@ -7490,7 +7494,7 @@
           <w:color w:val="222222"/>
           <w:sz w:val="22"/>
         </w:rPr>
-        <w:t>Los archivos están en test/. app.e2e-spec.ts comprueba que /docs responde y que una ruta protegida sin token devuelve 401. user-subject.e2e-spec.ts recorre el seed, el registro, el login, el logout (el token deja de servir), el rechazo a un estudiante que lista usuarios, el flujo de admin sobre roles y desactivación, y el CRUD de materias. tutor-booking.e2e-spec.ts recorre perfiles de tutor, filtros, verificación, creación de reservas, rechazo de cruces de horario, rechazo de materias que el tutor no dicta, confirmación, completado y cancelación. Vitest no corre esos archivos en paralelo porque comparten la misma base y ambos ejecutan el seed.</w:t>
+        <w:t>Los archivos están en test/ y son 38 pruebas. app.e2e-spec.ts comprueba que /docs responde y que una ruta protegida sin token devuelve 401. user-subject.e2e-spec.ts recorre el seed, el registro, el login, el logout (el token deja de servir), el rechazo a un estudiante que lista usuarios, el flujo de admin sobre roles y desactivación, y el CRUD de materias. tutor-booking.e2e-spec.ts recorre perfiles de tutor, filtros, verificación, creación de reservas, rechazo de cruces de horario, rechazo de materias que el tutor no dicta, confirmación, completado y cancelación. marketplace-rules.e2e-spec.ts recorre la búsqueda por universidad y materia, el filtro por tarifa y tutor verificado, las fechas inválidas, los rechazos por rol y la reseña: solo el estudiante dueño, solo si la reserva está COMPLETED, una sola vez, y el promedio queda visible para quien tenga sesión. Vitest no corre esos archivos en paralelo porque comparten la misma base y ejecutan el seed.</w:t>
       </w:r>
     </w:p>
     <w:p>
@@ -7553,7 +7557,7 @@
           <w:color w:val="222222"/>
           <w:sz w:val="22"/>
         </w:rPr>
-        <w:t>La colección de Postman está en postman/TutorLink.postman_collection.json. Trae la variable baseUrl y guarda el token al registrarse o iniciar sesión. Cubre usuarios, materias, tutores, reservas, reseñas y seed. El orden sugerido termina en completar la reserva, volver a entrar como el estudiante dueño y crear la reseña.</w:t>
+        <w:t>La colección de Postman está en postman/TutorLink.postman_collection.json. La variable baseUrl ya apunta a https://compu3-tallernest-tutorlink.onrender.com/tutorlink, que es la URL de la sustentación. Registrarse e iniciar sesión guardan el token. Cubre usuarios, materias, tutores, reservas, reseñas y seed. La carpeta Escenarios se corre después de Seed y comprueba los rechazos del marketplace: horario pasado o cruzado, materia que el tutor no dicta, rol equivocado, reseña antes de completar, reseña ajena, reseña duplicada y promedio. Las fechas de las reservas las calcula la colección. La variable seedKey tiene que coincidir con SEED_KEY del servicio en Render; si no, el seed responde 401.</w:t>
       </w:r>
     </w:p>
     <w:p>
@@ -7681,7 +7685,7 @@
           <w:color w:val="222222"/>
           <w:sz w:val="22"/>
         </w:rPr>
-        <w:t>Para probar la instancia desplegada se puede abrir Swagger, autorizar con un JWT obtenido en POST /tutorlink/user/auth, o importar la colección de Postman y cambiar baseUrl a https://compu3-tallernest-tutorlink.onrender.com/tutorlink. El seed de producción usa la SEED_KEY de ese entorno y borra los datos de esa base.</w:t>
+        <w:t>Para probar la instancia desplegada se abre Swagger o se importa la colección de Postman, que ya usa la URL de Render. Authorize, o el header Authorization, lleva el JWT de POST /tutorlink/user/auth. El seed de producción usa la SEED_KEY de ese entorno y borra los datos de esa base.</w:t>
       </w:r>
     </w:p>
     <w:p>
@@ -7837,7 +7841,7 @@
           <w:color w:val="222222"/>
           <w:sz w:val="22"/>
         </w:rPr>
-        <w:t>Un recorrido manual, también documentado en el README, es: seed, login de admin, crear o listar una materia, dar rol tutor, crear el perfil, verificarlo, reservar como estudiante, confirmar y completar como tutor, y reseñar como estudiante. Swagger y Postman cubren ese mismo recorrido.</w:t>
+        <w:t>Un recorrido manual, también documentado en el README, es: seed, login de admin, crear o listar una materia, dar rol tutor, crear el perfil, verificarlo, reservar como estudiante, confirmar y completar como tutor, y reseñar como estudiante. Swagger y Postman cubren ese mismo recorrido. En Postman, la carpeta Escenarios lo ejecuta contra la API desplegada.</w:t>
       </w:r>
     </w:p>
     <w:p>

</xml_diff>